<commit_message>
Change path and delete DEV_SPEC
Each DEV_SPEC shift in the CORE_COMM ==>
in the "users" folders assigned to each user
</commit_message>
<xml_diff>
--- a/CORE_COMM/readme/Documentation HydroModPy.docx
+++ b/CORE_COMM/readme/Documentation HydroModPy.docx
@@ -132,6 +132,55 @@
           <w:noProof/>
         </w:rPr>
       </w:pPr>
+      <w:r>
+        <w:rPr>
+          <w:noProof/>
+        </w:rPr>
+        <w:t>How structure a Python project :</w:t>
+      </w:r>
+    </w:p>
+    <w:p>
+      <w:pPr>
+        <w:spacing w:before="0" w:after="0" w:line="240" w:lineRule="auto"/>
+        <w:jc w:val="left"/>
+        <w:rPr>
+          <w:rFonts w:ascii="Times New Roman" w:eastAsia="Times New Roman" w:hAnsi="Times New Roman"/>
+        </w:rPr>
+      </w:pPr>
+      <w:r>
+        <w:t>- </w:t>
+      </w:r>
+      <w:hyperlink r:id="rId8" w:tgtFrame="_blank" w:history="1">
+        <w:r>
+          <w:rPr>
+            <w:rStyle w:val="Lienhypertexte"/>
+          </w:rPr>
+          <w:t>https://docs.python-guide.org/writing/structure/</w:t>
+        </w:r>
+      </w:hyperlink>
+      <w:r>
+        <w:t> </w:t>
+      </w:r>
+    </w:p>
+    <w:p>
+      <w:r>
+        <w:t>- </w:t>
+      </w:r>
+      <w:hyperlink r:id="rId9" w:tgtFrame="_blank" w:history="1">
+        <w:r>
+          <w:rPr>
+            <w:rStyle w:val="Lienhypertexte"/>
+          </w:rPr>
+          <w:t>https://github.com/pypa/sampleproject</w:t>
+        </w:r>
+      </w:hyperlink>
+    </w:p>
+    <w:p>
+      <w:pPr>
+        <w:rPr>
+          <w:noProof/>
+        </w:rPr>
+      </w:pPr>
     </w:p>
     <w:p>
       <w:pPr>
@@ -163,7 +212,7 @@
           <w:lang w:val="en-US"/>
         </w:rPr>
       </w:pPr>
-      <w:hyperlink r:id="rId8" w:history="1">
+      <w:hyperlink r:id="rId10" w:history="1">
         <w:r>
           <w:rPr>
             <w:rStyle w:val="Lienhypertexte"/>
@@ -482,8 +531,21 @@
       <w:r>
         <w:t xml:space="preserve"> </w:t>
       </w:r>
-      <w:r>
-        <w:t>fill this files for the Read the Docs</w:t>
+      <w:proofErr w:type="spellStart"/>
+      <w:r>
+        <w:t>fill</w:t>
+      </w:r>
+      <w:proofErr w:type="spellEnd"/>
+      <w:r>
+        <w:t xml:space="preserve"> </w:t>
+      </w:r>
+      <w:proofErr w:type="spellStart"/>
+      <w:r>
+        <w:t>this</w:t>
+      </w:r>
+      <w:proofErr w:type="spellEnd"/>
+      <w:r>
+        <w:t xml:space="preserve"> files for the Read the Docs</w:t>
       </w:r>
     </w:p>
     <w:p>
@@ -568,8 +630,13 @@
         <w:pStyle w:val="Doc"/>
       </w:pPr>
       <w:r>
-        <w:t>.readthedocs.yaml</w:t>
-      </w:r>
+        <w:t>.</w:t>
+      </w:r>
+      <w:proofErr w:type="spellStart"/>
+      <w:r>
+        <w:t>readthedocs.yaml</w:t>
+      </w:r>
+      <w:proofErr w:type="spellEnd"/>
     </w:p>
     <w:p>
       <w:pPr>
@@ -594,10 +661,10 @@
           <w:lang w:val="en-US"/>
         </w:rPr>
         <w:sectPr>
-          <w:headerReference w:type="even" r:id="rId9"/>
-          <w:footerReference w:type="even" r:id="rId10"/>
-          <w:headerReference w:type="first" r:id="rId11"/>
-          <w:footerReference w:type="first" r:id="rId12"/>
+          <w:headerReference w:type="even" r:id="rId11"/>
+          <w:footerReference w:type="even" r:id="rId12"/>
+          <w:headerReference w:type="first" r:id="rId13"/>
+          <w:footerReference w:type="first" r:id="rId14"/>
           <w:pgSz w:w="11907" w:h="16840" w:code="9"/>
           <w:pgMar w:top="1440" w:right="1077" w:bottom="1440" w:left="1077" w:header="709" w:footer="709" w:gutter="0"/>
           <w:cols w:space="708"/>
@@ -652,7 +719,7 @@
         </w:rPr>
         <w:tab/>
       </w:r>
-      <w:hyperlink r:id="rId13" w:history="1">
+      <w:hyperlink r:id="rId15" w:history="1">
         <w:r>
           <w:rPr>
             <w:rStyle w:val="Lienhypertexte"/>
@@ -692,7 +759,7 @@
         </w:rPr>
         <w:tab/>
       </w:r>
-      <w:hyperlink r:id="rId14" w:history="1">
+      <w:hyperlink r:id="rId16" w:history="1">
         <w:r>
           <w:rPr>
             <w:rStyle w:val="Lienhypertexte"/>
@@ -1144,7 +1211,7 @@
                     <pic:cNvPicPr/>
                   </pic:nvPicPr>
                   <pic:blipFill>
-                    <a:blip r:embed="rId15"/>
+                    <a:blip r:embed="rId17"/>
                     <a:stretch>
                       <a:fillRect/>
                     </a:stretch>
@@ -7998,6 +8065,11 @@
       <w:lang w:val="en-US"/>
     </w:rPr>
   </w:style>
+  <w:style w:type="character" w:customStyle="1" w:styleId="object">
+    <w:name w:val="object"/>
+    <w:basedOn w:val="Policepardfaut"/>
+    <w:rsid w:val="00971816"/>
+  </w:style>
 </w:styles>
 </file>
 

</xml_diff>